<commit_message>
Document Render deployment and live Gemini verification
</commit_message>
<xml_diff>
--- a/docs/project-report.docx
+++ b/docs/project-report.docx
@@ -455,7 +455,7 @@
         <w:rPr>
           <w:b w:val="0"/>
         </w:rPr>
-        <w:t>The implemented prototype includes CSV validation, regional and date filtering, visual summaries, natural-language questions, scenario calculations, and report exports. Fourteen automated tests verify the core calculations and provider contract. Browser checks verify the main user interactions. Live generative output quality has not been evaluated because no provider key was configured during verification. The application is an educational decision-support prototype, not a validated forecasting or autonomous decision-making system.</w:t>
+        <w:t>The implemented prototype includes CSV validation, regional and date filtering, visual summaries, natural-language questions, scenario calculations, and report exports. Fifteen automated tests verify the core calculations and provider contract. Browser checks verify the main user interactions. Live generative output quality has not been formally evaluated. The application is an educational decision-support prototype, not a validated forecasting or autonomous decision-making system.</w:t>
       </w:r>
     </w:p>
     <w:p>
@@ -1438,7 +1438,7 @@
         <w:rPr>
           <w:b w:val="0"/>
         </w:rPr>
-        <w:t>Local execution requires Node.js 22.13 or newer, npm, and a modern browser. React and TypeScript implement the interface; Vinext and Vite provide the application build and development server. Server routes run in a Cloudflare Workers-compatible environment. Gemini access is optional and requires an API key and a supported model in the provider account. No application database is required.</w:t>
+        <w:t>Local execution requires Node.js 22.13 or newer, npm, and a modern browser. React and TypeScript implement the interface. Render hosts the Next.js production build as a Node.js web service. The original Sites preview uses Vinext, Vite, and Cloudflare Workers with the same application code. Gemini requires a server API key and an available model. No application database is required.</w:t>
       </w:r>
     </w:p>
     <w:p>
@@ -3396,7 +3396,7 @@
         <w:rPr>
           <w:b w:val="0"/>
         </w:rPr>
-        <w:t>The backend builds a JSON context containing the question and computed summary. A system instruction requires the model to use supplied metrics, identify relevant periods and metric names, avoid invented values or causal claims, distinguish observations from hypotheses, and acknowledge missing information. Currency is INR, and profit is explicitly defined as gross profit from the cost column. Temperature is set to 0.25 to encourage restrained responses; this does not guarantee factual correctness.</w:t>
+        <w:t>The backend sends the question and computed summary as JSON. The system instruction requires supplied metrics, relevant periods, and clear distinctions between observations, hypotheses, and suggested experiments. It prohibits invented values and causal claims. Currency is INR, and profit means gross profit from the cost column. The response budget is 4,096 tokens. Grounding does not guarantee factual correctness.</w:t>
       </w:r>
     </w:p>
     <w:p>
@@ -3420,7 +3420,7 @@
         <w:rPr>
           <w:b w:val="0"/>
         </w:rPr>
-        <w:t>Without GEMINI_API_KEY, the server uses deterministic keyword routes for categories, regions, channels, margins, trends, and summary questions. Unsupported demo questions explain the limitation. With a key, the server calls the Gemini Generate Content endpoint using GEMINI_MODEL. Provider errors, empty answers, and timeouts produce visible errors rather than being silently relabeled as successful AI output. Requests have a 30-second provider timeout and a 40-second browser timeout.</w:t>
+        <w:t>Without GEMINI_API_KEY, keyword rules answer supported demo questions and explain their limits. With a key, the server calls Gemini Generate Content using GEMINI_MODEL. Provider errors, empty answers, and timeouts are shown explicitly. Transient failures are retried once within a 30-second provider timeout; the browser timeout is 40 seconds.</w:t>
       </w:r>
     </w:p>
     <w:p>
@@ -3436,7 +3436,7 @@
         <w:rPr>
           <w:b w:val="0"/>
         </w:rPr>
-        <w:t>Uploaded rows remain in browser memory until an insight question is submitted, at which point the selected records reach this application server for validation. The server forwards only aggregates to Gemini. Credentials are excluded from the frontend and ignored by Git. CSV exports protect formula-like text labels. The public demo uses rule-based responses without a provider key. Same-origin checks are implemented; production-grade quotas and per-user authorization remain outside the prototype.</w:t>
+        <w:t>Uploaded rows remain in browser memory until an insight question is submitted, at which point the selected records reach this application server for validation. The server forwards only aggregates to Gemini. Credentials are stored in Render environment settings, excluded from the frontend, and ignored by Git. CSV exports protect formula-like text labels. Same-origin checks are implemented; production-grade quotas and per-user authorization remain outside the prototype.</w:t>
       </w:r>
     </w:p>
     <w:p>
@@ -3716,7 +3716,7 @@
         <w:rPr>
           <w:b w:val="0"/>
         </w:rPr>
-        <w:t>The project includes 14 automated tests implemented with the Node.js test runner. The tests use fixed datasets and explicit expected values so that a calculation error produces a reproducible failure. The provider integration is tested using mock HTTP responses. The automated suite and TypeScript checks passed locally, and the production build completed.</w:t>
+        <w:t>All 15 Node.js tests, TypeScript checks, and both hosting builds passed. Provider payloads and a bounded retry are tested with mocks. A live Render request to gemini-3.5-flash-lite returned a generated answer with the correct sample revenue (INR 4,941,991), gross profit (INR 1,382,887), and leading category (Electronics). This smoke test verifies connectivity and selected facts, not general answer quality.</w:t>
       </w:r>
     </w:p>
     <w:tbl>
@@ -4653,7 +4653,7 @@
         <w:rPr>
           <w:b w:val="0"/>
         </w:rPr>
-        <w:t>The tests establish selected numerical and interaction behaviors. They do not establish real-world business usefulness, statistical forecasting accuracy, or language-model reliability. No live Gemini call, user study, large-scale load test, or production security audit was performed. An appropriate next evaluation would use a separately checked business dataset and human ratings of factual support, completeness, and actionability of generated answers.</w:t>
+        <w:t>A second live browser summary misstated average order value as INR 1,277.52; the verified calculation is INR 1,227.52. This illustrates why generated figures must be checked against the dashboard. No formal answer-quality study, load test, or production security audit was performed. The smoke tests do not establish forecasting accuracy or general model reliability. Availability also depends on provider service and quota.</w:t>
       </w:r>
     </w:p>
     <w:p>
@@ -4683,16 +4683,7 @@
         <w:spacing w:after="100"/>
       </w:pPr>
       <w:r>
-        <w:t>Install Node.js 22.13 or newer and npm.</w:t>
-      </w:r>
-    </w:p>
-    <w:p>
-      <w:pPr>
-        <w:pStyle w:val="ListBullet"/>
-        <w:spacing w:after="100"/>
-      </w:pPr>
-      <w:r>
-        <w:t>Clone https://github.com/vru9/genai-business-intelligence and enter the project directory.</w:t>
+        <w:t>Install Node.js 22.13 or newer and npm; clone the GitHub repository below.</w:t>
       </w:r>
     </w:p>
     <w:p>
@@ -4710,7 +4701,7 @@
         <w:spacing w:after="100"/>
       </w:pPr>
       <w:r>
-        <w:t>For optional generative mode, copy .dev.vars.example to .dev.vars, set GEMINI_API_KEY and GEMINI_MODEL, and restart.</w:t>
+        <w:t>For local Gemini, copy .dev.vars.example to .dev.vars and enter the key. The Next.js runtime uses .env.local instead.</w:t>
       </w:r>
     </w:p>
     <w:p>
@@ -4719,7 +4710,7 @@
         <w:spacing w:after="100"/>
       </w:pPr>
       <w:r>
-        <w:t>Run npm test and npm run typecheck to verify the project; npm run build creates the deployment build.</w:t>
+        <w:t>Run npm test and npm run typecheck. For Render, use npm run build:render and npm run start:render.</w:t>
       </w:r>
     </w:p>
     <w:p>
@@ -4735,7 +4726,7 @@
         <w:rPr>
           <w:b w:val="0"/>
         </w:rPr>
-        <w:t>The GitHub repository is public so faculty can inspect the source, sample data, tests, screenshots, and this report. The hosted application uses the Sites platform and is public, so anyone with its link can open the demo. Faculty can also run the repository locally. The public demo works without a provider key using clearly labeled rule-based responses. API keys are not included in the repository.</w:t>
+        <w:t>The GitHub repository and Render web application are public for faculty access. The service uses Node.js 22, a free instance in Singapore, and /api/insights for its health check. GEMINI_API_KEY is saved only in Render environment settings. The free instance may need about a minute to wake after inactivity. No API keys are included in the repository.</w:t>
       </w:r>
     </w:p>
     <w:p>
@@ -4743,10 +4734,28 @@
         <w:rPr>
           <w:b w:val="0"/>
         </w:rPr>
-        <w:t>Repository: https://github.com/vru9/genai-business-intelligence</w:t>
+        <w:t xml:space="preserve">Repository: </w:t>
+      </w:r>
+      <w:hyperlink r:id="rId14">
+        <w:r>
+          <w:rPr>
+            <w:u w:val="single"/>
+          </w:rPr>
+          <w:t>https://github.com/vru9/genai-business-intelligence</w:t>
+        </w:r>
+      </w:hyperlink>
+      <w:r>
         <w:br/>
-        <w:t>Hosted address: https://insight-bi-vruddhi.rajdeepvp273.chatgpt.site</w:t>
+        <w:t xml:space="preserve">Hosted address: </w:t>
       </w:r>
+      <w:hyperlink r:id="rId15">
+        <w:r>
+          <w:rPr>
+            <w:u w:val="single"/>
+          </w:rPr>
+          <w:t>https://insight-bi-group8.onrender.com</w:t>
+        </w:r>
+      </w:hyperlink>
     </w:p>
     <w:p>
       <w:pPr>
@@ -4975,7 +4984,7 @@
           <w:b w:val="0"/>
           <w:sz w:val="18"/>
         </w:rPr>
-        <w:t>4. Cloudflare. Cloudflare Workers documentation. https://developers.cloudflare.com/workers/</w:t>
+        <w:t>4. Render. Deploy a Next.js app. https://render.com/docs/deploy-nextjs-app</w:t>
       </w:r>
     </w:p>
     <w:p>

</xml_diff>